<commit_message>
Rename CDS entities to no-underscore form per customer system convention
/ILG/I_MM_Gp_Qmma_Status -> /ILG/IMMGpQmmaStatus
/ILG/I_MM_Gp_Clearing    -> /ILG/IMMGpClearing
/ILG/I_MM_Green_Track    -> /ILG/IMMGreenTrack

Matches the names the user created in HANA Studio (entity names without
underscores). All select-list fields verified to carry explicit aliases.
Docs and Merkava spec docx regenerated with the new names.

Co-Authored-By: Claude Fable 5 <noreply@anthropic.com>
Claude-Session: https://claude.ai/code/session_01DJGnX3fs4N1zpoFwvs7VjS
</commit_message>
<xml_diff>
--- a/docs/cds/אפיון_GREEN_TRACK.docx
+++ b/docs/cds/אפיון_GREEN_TRACK.docx
@@ -129,7 +129,7 @@
                 <w:sz w:val="20"/>
                 <w:szCs w:val="20"/>
               </w:rPr>
-              <w:t xml:space="preserve">‎/ILG/I_MM_Green_Track‎</w:t>
+              <w:t xml:space="preserve">‎/ILG/IMMGreenTrack‎</w:t>
             </w:r>
           </w:p>
         </w:tc>
@@ -222,7 +222,7 @@
                 <w:sz w:val="20"/>
                 <w:szCs w:val="20"/>
               </w:rPr>
-              <w:t xml:space="preserve">‎/ILG/I_MM_Gp_Qmma_Status‎</w:t>
+              <w:t xml:space="preserve">‎/ILG/IMMGpQmmaStatus‎</w:t>
             </w:r>
           </w:p>
         </w:tc>
@@ -315,7 +315,7 @@
                 <w:sz w:val="20"/>
                 <w:szCs w:val="20"/>
               </w:rPr>
-              <w:t xml:space="preserve">‎/ILG/I_MM_Gp_Clearing‎</w:t>
+              <w:t xml:space="preserve">‎/ILG/IMMGpClearing‎</w:t>
             </w:r>
           </w:p>
         </w:tc>
@@ -5016,7 +5016,7 @@
           <w:sz w:val="24"/>
           <w:szCs w:val="24"/>
         </w:rPr>
-        <w:t xml:space="preserve">5.1.	תחילה יש לאסוף עבור כל סט את קודי הסטטוס מטבלת QMMA (ב-View העזר /ILG/I_MM_Gp_Qmma_Status), באופן הבא:</w:t>
+        <w:t xml:space="preserve">5.1.	תחילה יש לאסוף עבור כל סט את קודי הסטטוס מטבלת QMMA (ב-View העזר /ILG/IMMGpQmmaStatus), באופן הבא:</w:t>
       </w:r>
     </w:p>
     <w:tbl>
@@ -5072,7 +5072,7 @@
                 <w:sz w:val="20"/>
                 <w:szCs w:val="20"/>
               </w:rPr>
-              <w:t xml:space="preserve">שם שדה ב /ILG/I_MM_Gp_Qmma_Status</w:t>
+              <w:t xml:space="preserve">שם שדה ב /ILG/IMMGpQmmaStatus</w:t>
             </w:r>
           </w:p>
         </w:tc>
@@ -6994,7 +6994,7 @@
           <w:sz w:val="24"/>
           <w:szCs w:val="24"/>
         </w:rPr>
-        <w:t xml:space="preserve">5.5.	בנוסף יש לבדוק האם החשבונית שולמה בפועל ( ב-View העזר /ILG/I_MM_Gp_Clearing מעל ACDOCA ), באופן הבא:</w:t>
+        <w:t xml:space="preserve">5.5.	בנוסף יש לבדוק האם החשבונית שולמה בפועל ( ב-View העזר /ILG/IMMGpClearing מעל ACDOCA ), באופן הבא:</w:t>
       </w:r>
     </w:p>
     <w:tbl>
@@ -8800,7 +8800,7 @@
                 <w:sz w:val="20"/>
                 <w:szCs w:val="20"/>
               </w:rPr>
-              <w:t xml:space="preserve">שם שדה ב /ILG/I_MM_Green_Track</w:t>
+              <w:t xml:space="preserve">שם שדה ב /ILG/IMMGreenTrack</w:t>
             </w:r>
           </w:p>
         </w:tc>

</xml_diff>